<commit_message>
docs: finalize approved reports and pull request references
</commit_message>
<xml_diff>
--- a/reports/practice-6/Практическая работа 6.docx
+++ b/reports/practice-6/Практическая работа 6.docx
@@ -4904,7 +4904,7 @@
         <w:widowControl/>
       </w:pPr>
       <w:r>
-        <w:t>Исходные тексты, сценарии, документация и материалы отчётов подготовлены в отдельной ветке codex/practices-5-7 репозитория Tools_DevOps. Контрольная работа №8 в эту работу не включена. Сведения о Pull Request и его фактическом состоянии приведены в разделе источников. Основная ветка автоматически не изменяется.</w:t>
+        <w:t>Исходные тексты, сценарии, документация и материалы отчётов подготовлены в отдельной ветке codex/practices-5-7 репозитория Tools_DevOps. Сведения о Pull Request и его фактическом состоянии приведены в разделе источников. Слияние итогового Pull Request в main согласовано владельцем репозитория.</w:t>
       </w:r>
     </w:p>
     <w:p>
@@ -5379,7 +5379,7 @@
         <w:rPr>
           <w:sz w:val="22"/>
         </w:rPr>
-        <w:t>Pull Request: https://github.com/Hehekutov/Tools_DevOps/pull/3. Открыт, слияние в main ожидает подтверждения владельца.</w:t>
+        <w:t>Pull Request: https://github.com/Hehekutov/Tools_DevOps/pull/3. Согласовано владельцем репозитория.</w:t>
       </w:r>
     </w:p>
     <w:p>

</xml_diff>